<commit_message>
docs: Vazhdimi i disa pikave te tjera te raportit teknin 1
</commit_message>
<xml_diff>
--- a/docs/Agnesa_Kryeziu_Raporti_Teknik_1.docx
+++ b/docs/Agnesa_Kryeziu_Raporti_Teknik_1.docx
@@ -5,26 +5,17 @@
     <w:p>
       <w:pPr>
         <w:spacing w:after="100"/>
-        <w:rPr>
-          <w:rFonts w:hint="eastAsia"/>
-        </w:rPr>
       </w:pPr>
     </w:p>
     <w:p>
       <w:pPr>
         <w:spacing w:after="100"/>
-        <w:rPr>
-          <w:rFonts w:hint="eastAsia"/>
-        </w:rPr>
       </w:pPr>
     </w:p>
     <w:p>
       <w:pPr>
         <w:spacing w:after="100"/>
         <w:jc w:val="center"/>
-        <w:rPr>
-          <w:rFonts w:hint="eastAsia"/>
-        </w:rPr>
       </w:pPr>
       <w:r>
         <w:rPr>
@@ -38,9 +29,6 @@
       <w:pPr>
         <w:spacing w:after="100"/>
         <w:jc w:val="center"/>
-        <w:rPr>
-          <w:rFonts w:hint="eastAsia"/>
-        </w:rPr>
       </w:pPr>
       <w:r>
         <w:rPr>
@@ -52,34 +40,22 @@
     <w:p>
       <w:pPr>
         <w:spacing w:after="100"/>
-        <w:rPr>
-          <w:rFonts w:hint="eastAsia"/>
-        </w:rPr>
       </w:pPr>
     </w:p>
     <w:p>
       <w:pPr>
         <w:spacing w:after="100"/>
-        <w:rPr>
-          <w:rFonts w:hint="eastAsia"/>
-        </w:rPr>
       </w:pPr>
     </w:p>
     <w:p>
       <w:pPr>
         <w:spacing w:after="100"/>
-        <w:rPr>
-          <w:rFonts w:hint="eastAsia"/>
-        </w:rPr>
       </w:pPr>
     </w:p>
     <w:p>
       <w:pPr>
         <w:spacing w:after="100"/>
         <w:jc w:val="center"/>
-        <w:rPr>
-          <w:rFonts w:hint="eastAsia"/>
-        </w:rPr>
       </w:pPr>
       <w:r>
         <w:rPr>
@@ -94,9 +70,6 @@
       <w:pPr>
         <w:spacing w:after="100"/>
         <w:jc w:val="center"/>
-        <w:rPr>
-          <w:rFonts w:hint="eastAsia"/>
-        </w:rPr>
       </w:pPr>
       <w:r>
         <w:rPr>
@@ -120,9 +93,6 @@
       <w:pPr>
         <w:spacing w:after="100"/>
         <w:jc w:val="center"/>
-        <w:rPr>
-          <w:rFonts w:hint="eastAsia"/>
-        </w:rPr>
       </w:pPr>
       <w:r>
         <w:rPr>
@@ -134,25 +104,16 @@
     <w:p>
       <w:pPr>
         <w:spacing w:after="100"/>
-        <w:rPr>
-          <w:rFonts w:hint="eastAsia"/>
-        </w:rPr>
       </w:pPr>
     </w:p>
     <w:p>
       <w:pPr>
         <w:spacing w:after="100"/>
-        <w:rPr>
-          <w:rFonts w:hint="eastAsia"/>
-        </w:rPr>
       </w:pPr>
     </w:p>
     <w:p>
       <w:pPr>
         <w:spacing w:after="100"/>
-        <w:rPr>
-          <w:rFonts w:hint="eastAsia"/>
-        </w:rPr>
       </w:pPr>
     </w:p>
     <w:tbl>
@@ -174,14 +135,10 @@
         <w:tc>
           <w:tcPr>
             <w:tcW w:w="2835" w:type="dxa"/>
-            <w:shd w:val="clear" w:color="auto" w:fill="FFFFFF"/>
           </w:tcPr>
           <w:p>
             <w:pPr>
               <w:spacing w:before="40" w:after="40"/>
-              <w:rPr>
-                <w:rFonts w:hint="eastAsia"/>
-              </w:rPr>
             </w:pPr>
             <w:r>
               <w:rPr>
@@ -195,14 +152,10 @@
         <w:tc>
           <w:tcPr>
             <w:tcW w:w="6236" w:type="dxa"/>
-            <w:shd w:val="clear" w:color="auto" w:fill="FFFFFF"/>
           </w:tcPr>
           <w:p>
             <w:pPr>
               <w:spacing w:before="40" w:after="40"/>
-              <w:rPr>
-                <w:rFonts w:hint="eastAsia"/>
-              </w:rPr>
             </w:pPr>
           </w:p>
         </w:tc>
@@ -214,14 +167,10 @@
         <w:tc>
           <w:tcPr>
             <w:tcW w:w="2835" w:type="dxa"/>
-            <w:shd w:val="clear" w:color="auto" w:fill="FFFFFF"/>
           </w:tcPr>
           <w:p>
             <w:pPr>
               <w:spacing w:before="40" w:after="40"/>
-              <w:rPr>
-                <w:rFonts w:hint="eastAsia"/>
-              </w:rPr>
             </w:pPr>
             <w:r>
               <w:rPr>
@@ -234,14 +183,10 @@
         <w:tc>
           <w:tcPr>
             <w:tcW w:w="6236" w:type="dxa"/>
-            <w:shd w:val="clear" w:color="auto" w:fill="FFFFFF"/>
           </w:tcPr>
           <w:p>
             <w:pPr>
               <w:spacing w:before="40" w:after="40"/>
-              <w:rPr>
-                <w:rFonts w:hint="eastAsia"/>
-              </w:rPr>
             </w:pPr>
             <w:r>
               <w:rPr>
@@ -259,14 +204,10 @@
         <w:tc>
           <w:tcPr>
             <w:tcW w:w="2835" w:type="dxa"/>
-            <w:shd w:val="clear" w:color="auto" w:fill="FFFFFF"/>
           </w:tcPr>
           <w:p>
             <w:pPr>
               <w:spacing w:before="40" w:after="40"/>
-              <w:rPr>
-                <w:rFonts w:hint="eastAsia"/>
-              </w:rPr>
             </w:pPr>
             <w:r>
               <w:rPr>
@@ -279,14 +220,10 @@
         <w:tc>
           <w:tcPr>
             <w:tcW w:w="6236" w:type="dxa"/>
-            <w:shd w:val="clear" w:color="auto" w:fill="FFFFFF"/>
           </w:tcPr>
           <w:p>
             <w:pPr>
               <w:spacing w:before="40" w:after="40"/>
-              <w:rPr>
-                <w:rFonts w:hint="eastAsia"/>
-              </w:rPr>
             </w:pPr>
             <w:r>
               <w:rPr>
@@ -304,14 +241,10 @@
         <w:tc>
           <w:tcPr>
             <w:tcW w:w="2835" w:type="dxa"/>
-            <w:shd w:val="clear" w:color="auto" w:fill="FFFFFF"/>
           </w:tcPr>
           <w:p>
             <w:pPr>
               <w:spacing w:before="40" w:after="40"/>
-              <w:rPr>
-                <w:rFonts w:hint="eastAsia"/>
-              </w:rPr>
             </w:pPr>
             <w:r>
               <w:rPr>
@@ -324,14 +257,10 @@
         <w:tc>
           <w:tcPr>
             <w:tcW w:w="6236" w:type="dxa"/>
-            <w:shd w:val="clear" w:color="auto" w:fill="FFFFFF"/>
           </w:tcPr>
           <w:p>
             <w:pPr>
               <w:spacing w:before="40" w:after="40"/>
-              <w:rPr>
-                <w:rFonts w:hint="eastAsia"/>
-              </w:rPr>
             </w:pPr>
             <w:r>
               <w:rPr>
@@ -349,14 +278,10 @@
         <w:tc>
           <w:tcPr>
             <w:tcW w:w="2835" w:type="dxa"/>
-            <w:shd w:val="clear" w:color="auto" w:fill="FFFFFF"/>
           </w:tcPr>
           <w:p>
             <w:pPr>
               <w:spacing w:before="40" w:after="40"/>
-              <w:rPr>
-                <w:rFonts w:hint="eastAsia"/>
-              </w:rPr>
             </w:pPr>
             <w:r>
               <w:rPr>
@@ -369,14 +294,10 @@
         <w:tc>
           <w:tcPr>
             <w:tcW w:w="6236" w:type="dxa"/>
-            <w:shd w:val="clear" w:color="auto" w:fill="FFFFFF"/>
           </w:tcPr>
           <w:p>
             <w:pPr>
               <w:spacing w:before="40" w:after="40"/>
-              <w:rPr>
-                <w:rFonts w:hint="eastAsia"/>
-              </w:rPr>
             </w:pPr>
             <w:r>
               <w:rPr>
@@ -394,14 +315,10 @@
         <w:tc>
           <w:tcPr>
             <w:tcW w:w="2835" w:type="dxa"/>
-            <w:shd w:val="clear" w:color="auto" w:fill="FFFFFF"/>
           </w:tcPr>
           <w:p>
             <w:pPr>
               <w:spacing w:before="40" w:after="40"/>
-              <w:rPr>
-                <w:rFonts w:hint="eastAsia"/>
-              </w:rPr>
             </w:pPr>
             <w:r>
               <w:rPr>
@@ -414,14 +331,10 @@
         <w:tc>
           <w:tcPr>
             <w:tcW w:w="6236" w:type="dxa"/>
-            <w:shd w:val="clear" w:color="auto" w:fill="FFFFFF"/>
           </w:tcPr>
           <w:p>
             <w:pPr>
               <w:spacing w:before="40" w:after="40"/>
-              <w:rPr>
-                <w:rFonts w:hint="eastAsia"/>
-              </w:rPr>
             </w:pPr>
             <w:r>
               <w:rPr>
@@ -433,22 +346,6 @@
         </w:tc>
       </w:tr>
     </w:tbl>
-    <w:p>
-      <w:pPr>
-        <w:spacing w:after="100"/>
-        <w:rPr>
-          <w:rFonts w:hint="eastAsia"/>
-        </w:rPr>
-      </w:pPr>
-    </w:p>
-    <w:p>
-      <w:pPr>
-        <w:spacing w:after="100"/>
-        <w:rPr>
-          <w:rFonts w:hint="eastAsia"/>
-        </w:rPr>
-      </w:pPr>
-    </w:p>
     <w:p>
       <w:pPr>
         <w:spacing w:after="100"/>
@@ -467,58 +364,9 @@
     <w:p>
       <w:pPr>
         <w:spacing w:after="100"/>
-      </w:pPr>
-    </w:p>
-    <w:p>
-      <w:pPr>
-        <w:spacing w:after="100"/>
-      </w:pPr>
-    </w:p>
-    <w:p>
-      <w:pPr>
-        <w:spacing w:after="100"/>
-      </w:pPr>
-    </w:p>
-    <w:p>
-      <w:pPr>
-        <w:spacing w:after="100"/>
-      </w:pPr>
-    </w:p>
-    <w:p>
-      <w:pPr>
-        <w:spacing w:after="100"/>
-      </w:pPr>
-    </w:p>
-    <w:p>
-      <w:pPr>
-        <w:spacing w:after="100"/>
-      </w:pPr>
-    </w:p>
-    <w:p>
-      <w:pPr>
-        <w:spacing w:after="100"/>
-      </w:pPr>
-    </w:p>
-    <w:p>
-      <w:pPr>
-        <w:spacing w:after="100"/>
-      </w:pPr>
-    </w:p>
-    <w:p>
-      <w:pPr>
-        <w:spacing w:after="100"/>
-      </w:pPr>
-    </w:p>
-    <w:p>
-      <w:pPr>
-        <w:spacing w:after="100"/>
-      </w:pPr>
-    </w:p>
-    <w:p>
-      <w:pPr>
-        <w:spacing w:after="100"/>
+        <w:jc w:val="center"/>
         <w:rPr>
-          <w:rFonts w:hint="eastAsia"/>
+          <w:b/>
         </w:rPr>
       </w:pPr>
     </w:p>
@@ -527,8 +375,113 @@
         <w:spacing w:after="100"/>
         <w:jc w:val="center"/>
         <w:rPr>
-          <w:rFonts w:hint="eastAsia"/>
+          <w:b/>
         </w:rPr>
+      </w:pPr>
+    </w:p>
+    <w:p>
+      <w:pPr>
+        <w:spacing w:after="100"/>
+        <w:jc w:val="center"/>
+        <w:rPr>
+          <w:b/>
+        </w:rPr>
+      </w:pPr>
+    </w:p>
+    <w:p>
+      <w:pPr>
+        <w:spacing w:after="100"/>
+        <w:jc w:val="center"/>
+        <w:rPr>
+          <w:b/>
+        </w:rPr>
+      </w:pPr>
+    </w:p>
+    <w:p>
+      <w:pPr>
+        <w:spacing w:after="100"/>
+        <w:jc w:val="center"/>
+        <w:rPr>
+          <w:b/>
+        </w:rPr>
+      </w:pPr>
+    </w:p>
+    <w:p>
+      <w:pPr>
+        <w:spacing w:after="100"/>
+        <w:jc w:val="center"/>
+        <w:rPr>
+          <w:b/>
+        </w:rPr>
+      </w:pPr>
+    </w:p>
+    <w:p>
+      <w:pPr>
+        <w:spacing w:after="100"/>
+        <w:jc w:val="center"/>
+        <w:rPr>
+          <w:b/>
+        </w:rPr>
+      </w:pPr>
+    </w:p>
+    <w:p>
+      <w:pPr>
+        <w:spacing w:after="100"/>
+        <w:jc w:val="center"/>
+        <w:rPr>
+          <w:b/>
+        </w:rPr>
+      </w:pPr>
+    </w:p>
+    <w:p>
+      <w:pPr>
+        <w:spacing w:after="100"/>
+        <w:jc w:val="center"/>
+        <w:rPr>
+          <w:b/>
+        </w:rPr>
+      </w:pPr>
+    </w:p>
+    <w:p>
+      <w:pPr>
+        <w:spacing w:after="100"/>
+        <w:jc w:val="center"/>
+        <w:rPr>
+          <w:b/>
+        </w:rPr>
+      </w:pPr>
+    </w:p>
+    <w:p>
+      <w:pPr>
+        <w:spacing w:after="100"/>
+        <w:jc w:val="center"/>
+        <w:rPr>
+          <w:b/>
+        </w:rPr>
+      </w:pPr>
+    </w:p>
+    <w:p>
+      <w:pPr>
+        <w:spacing w:after="100"/>
+        <w:jc w:val="center"/>
+        <w:rPr>
+          <w:b/>
+        </w:rPr>
+      </w:pPr>
+    </w:p>
+    <w:p>
+      <w:pPr>
+        <w:spacing w:after="100"/>
+        <w:jc w:val="center"/>
+        <w:rPr>
+          <w:b/>
+        </w:rPr>
+      </w:pPr>
+    </w:p>
+    <w:p>
+      <w:pPr>
+        <w:spacing w:after="100"/>
+        <w:jc w:val="center"/>
       </w:pPr>
       <w:proofErr w:type="gramStart"/>
       <w:r>
@@ -571,9 +524,6 @@
     <w:p>
       <w:pPr>
         <w:spacing w:after="100"/>
-        <w:rPr>
-          <w:rFonts w:hint="eastAsia"/>
-        </w:rPr>
       </w:pPr>
       <w:r>
         <w:t>Menaxhimi i banesave me qira përfshin të dhëna për pronarë, banesa, qiramarrës, kontrata dhe pagesa mujore. Kur këto ruhen në fletore ose dokumente të ndara, bëhet e vështirë të dihet se cila banesë është e lirë, kur përfundon një kontratë dhe cilat pagesa kanë mbetur pa u kryer.</w:t>
@@ -591,9 +541,6 @@
     <w:p>
       <w:pPr>
         <w:spacing w:after="100"/>
-        <w:rPr>
-          <w:rFonts w:hint="eastAsia"/>
-        </w:rPr>
       </w:pPr>
       <w:r>
         <w:t>Propozoj një aplikacion web ku administratori mund t’i regjistrojë banesat, t’i lidhë ato me pronarët dhe qiramarrësit, të krijojë kontrata dhe të përcjellë pagesat. Informacioni ruhet në një databazë të vetme dhe mund të gjendet me kërkim ose filtrim.</w:t>
@@ -627,14 +574,10 @@
         <w:tc>
           <w:tcPr>
             <w:tcW w:w="2268" w:type="dxa"/>
-            <w:shd w:val="clear" w:color="auto" w:fill="FFFFFF"/>
           </w:tcPr>
           <w:p>
             <w:pPr>
               <w:spacing w:before="40" w:after="40"/>
-              <w:rPr>
-                <w:rFonts w:hint="eastAsia"/>
-              </w:rPr>
             </w:pPr>
             <w:r>
               <w:rPr>
@@ -648,14 +591,10 @@
         <w:tc>
           <w:tcPr>
             <w:tcW w:w="6803" w:type="dxa"/>
-            <w:shd w:val="clear" w:color="auto" w:fill="FFFFFF"/>
           </w:tcPr>
           <w:p>
             <w:pPr>
               <w:spacing w:before="40" w:after="40"/>
-              <w:rPr>
-                <w:rFonts w:hint="eastAsia"/>
-              </w:rPr>
             </w:pPr>
             <w:r>
               <w:rPr>
@@ -674,14 +613,10 @@
         <w:tc>
           <w:tcPr>
             <w:tcW w:w="2268" w:type="dxa"/>
-            <w:shd w:val="clear" w:color="auto" w:fill="FFFFFF"/>
           </w:tcPr>
           <w:p>
             <w:pPr>
               <w:spacing w:before="40" w:after="40"/>
-              <w:rPr>
-                <w:rFonts w:hint="eastAsia"/>
-              </w:rPr>
             </w:pPr>
             <w:r>
               <w:rPr>
@@ -694,14 +629,10 @@
         <w:tc>
           <w:tcPr>
             <w:tcW w:w="6803" w:type="dxa"/>
-            <w:shd w:val="clear" w:color="auto" w:fill="FFFFFF"/>
           </w:tcPr>
           <w:p>
             <w:pPr>
               <w:spacing w:before="40" w:after="40"/>
-              <w:rPr>
-                <w:rFonts w:hint="eastAsia"/>
-              </w:rPr>
             </w:pPr>
             <w:r>
               <w:rPr>
@@ -719,14 +650,10 @@
         <w:tc>
           <w:tcPr>
             <w:tcW w:w="2268" w:type="dxa"/>
-            <w:shd w:val="clear" w:color="auto" w:fill="FFFFFF"/>
           </w:tcPr>
           <w:p>
             <w:pPr>
               <w:spacing w:before="40" w:after="40"/>
-              <w:rPr>
-                <w:rFonts w:hint="eastAsia"/>
-              </w:rPr>
             </w:pPr>
             <w:r>
               <w:rPr>
@@ -739,14 +666,10 @@
         <w:tc>
           <w:tcPr>
             <w:tcW w:w="6803" w:type="dxa"/>
-            <w:shd w:val="clear" w:color="auto" w:fill="FFFFFF"/>
           </w:tcPr>
           <w:p>
             <w:pPr>
               <w:spacing w:before="40" w:after="40"/>
-              <w:rPr>
-                <w:rFonts w:hint="eastAsia"/>
-              </w:rPr>
             </w:pPr>
             <w:r>
               <w:rPr>
@@ -764,14 +687,10 @@
         <w:tc>
           <w:tcPr>
             <w:tcW w:w="2268" w:type="dxa"/>
-            <w:shd w:val="clear" w:color="auto" w:fill="FFFFFF"/>
           </w:tcPr>
           <w:p>
             <w:pPr>
               <w:spacing w:before="40" w:after="40"/>
-              <w:rPr>
-                <w:rFonts w:hint="eastAsia"/>
-              </w:rPr>
             </w:pPr>
             <w:r>
               <w:rPr>
@@ -784,14 +703,10 @@
         <w:tc>
           <w:tcPr>
             <w:tcW w:w="6803" w:type="dxa"/>
-            <w:shd w:val="clear" w:color="auto" w:fill="FFFFFF"/>
           </w:tcPr>
           <w:p>
             <w:pPr>
               <w:spacing w:before="40" w:after="40"/>
-              <w:rPr>
-                <w:rFonts w:hint="eastAsia"/>
-              </w:rPr>
             </w:pPr>
             <w:r>
               <w:rPr>
@@ -806,9 +721,6 @@
     <w:p>
       <w:pPr>
         <w:spacing w:after="100"/>
-        <w:rPr>
-          <w:rFonts w:hint="eastAsia"/>
-        </w:rPr>
       </w:pPr>
     </w:p>
     <w:p>
@@ -817,15 +729,7 @@
         <w:spacing w:after="100"/>
       </w:pPr>
       <w:r>
-        <w:t xml:space="preserve">1.4 </w:t>
-      </w:r>
-      <w:proofErr w:type="spellStart"/>
-      <w:r>
-        <w:t>Qëllimi</w:t>
-      </w:r>
-      <w:proofErr w:type="spellEnd"/>
-      <w:r>
-        <w:t xml:space="preserve"> </w:t>
+        <w:t xml:space="preserve">1.4 Qëllimi </w:t>
       </w:r>
       <w:proofErr w:type="spellStart"/>
       <w:r>
@@ -1732,6 +1636,19 @@
       <w:pPr>
         <w:pStyle w:val="Heading2"/>
         <w:spacing w:after="100"/>
+        <w:rPr>
+          <w:rFonts w:ascii="Aptos" w:eastAsiaTheme="minorEastAsia" w:hAnsi="Aptos" w:cstheme="minorBidi"/>
+          <w:b w:val="0"/>
+          <w:bCs w:val="0"/>
+          <w:sz w:val="20"/>
+          <w:szCs w:val="22"/>
+        </w:rPr>
+      </w:pPr>
+    </w:p>
+    <w:p>
+      <w:pPr>
+        <w:pStyle w:val="Heading2"/>
+        <w:spacing w:after="100"/>
       </w:pPr>
       <w:proofErr w:type="gramStart"/>
       <w:r>
@@ -1766,49 +1683,14 @@
     <w:p>
       <w:pPr>
         <w:pStyle w:val="ListBullet"/>
-        <w:rPr>
-          <w:rFonts w:hint="eastAsia"/>
-        </w:rPr>
       </w:pPr>
-      <w:proofErr w:type="spellStart"/>
       <w:r>
-        <w:t>Organizimi</w:t>
-      </w:r>
-      <w:proofErr w:type="spellEnd"/>
-      <w:r>
-        <w:t xml:space="preserve"> </w:t>
-      </w:r>
-      <w:proofErr w:type="spellStart"/>
-      <w:r>
-        <w:t>i</w:t>
-      </w:r>
-      <w:proofErr w:type="spellEnd"/>
-      <w:r>
-        <w:t xml:space="preserve"> </w:t>
-      </w:r>
-      <w:proofErr w:type="spellStart"/>
-      <w:r>
-        <w:t>të</w:t>
-      </w:r>
-      <w:proofErr w:type="spellEnd"/>
-      <w:r>
-        <w:t xml:space="preserve"> </w:t>
-      </w:r>
-      <w:proofErr w:type="spellStart"/>
-      <w:r>
-        <w:t>dhënave</w:t>
-      </w:r>
-      <w:proofErr w:type="spellEnd"/>
-      <w:r>
-        <w:t xml:space="preserve"> të banesave dhe i statusit të tyre në një vend.</w:t>
+        <w:t>Organizimi i të dhënave të banesave dhe i statusit të tyre në një vend.</w:t>
       </w:r>
     </w:p>
     <w:p>
       <w:pPr>
         <w:pStyle w:val="ListBullet"/>
-        <w:rPr>
-          <w:rFonts w:hint="eastAsia"/>
-        </w:rPr>
       </w:pPr>
       <w:r>
         <w:t>Regjistrimi i pronarëve dhe qiramarrësve pa dublime të panevojshme.</w:t>
@@ -1817,9 +1699,6 @@
     <w:p>
       <w:pPr>
         <w:pStyle w:val="ListBullet"/>
-        <w:rPr>
-          <w:rFonts w:hint="eastAsia"/>
-        </w:rPr>
       </w:pPr>
       <w:r>
         <w:t>Krijimi i kontratave me datë fillimi, datë përfundimi dhe qira mujore.</w:t>
@@ -1828,9 +1707,6 @@
     <w:p>
       <w:pPr>
         <w:pStyle w:val="ListBullet"/>
-        <w:rPr>
-          <w:rFonts w:hint="eastAsia"/>
-        </w:rPr>
       </w:pPr>
       <w:r>
         <w:t>Evidentimi i pagesave dhe dallimi i obligimeve të papaguara.</w:t>
@@ -1839,9 +1715,6 @@
     <w:p>
       <w:pPr>
         <w:pStyle w:val="ListBullet"/>
-        <w:rPr>
-          <w:rFonts w:hint="eastAsia"/>
-        </w:rPr>
       </w:pPr>
       <w:r>
         <w:t>Kërkimi dhe paraqitja e një përmbledhjeje të qartë për administratorin.</w:t>
@@ -1866,14 +1739,10 @@
         <w:tc>
           <w:tcPr>
             <w:tcW w:w="1134" w:type="dxa"/>
-            <w:shd w:val="clear" w:color="auto" w:fill="FFFFFF"/>
           </w:tcPr>
           <w:p>
             <w:pPr>
               <w:spacing w:before="40" w:after="40"/>
-              <w:rPr>
-                <w:rFonts w:hint="eastAsia"/>
-              </w:rPr>
             </w:pPr>
             <w:r>
               <w:rPr>
@@ -1887,14 +1756,10 @@
         <w:tc>
           <w:tcPr>
             <w:tcW w:w="7937" w:type="dxa"/>
-            <w:shd w:val="clear" w:color="auto" w:fill="FFFFFF"/>
           </w:tcPr>
           <w:p>
             <w:pPr>
               <w:spacing w:before="40" w:after="40"/>
-              <w:rPr>
-                <w:rFonts w:hint="eastAsia"/>
-              </w:rPr>
             </w:pPr>
             <w:r>
               <w:rPr>
@@ -1913,14 +1778,10 @@
         <w:tc>
           <w:tcPr>
             <w:tcW w:w="1134" w:type="dxa"/>
-            <w:shd w:val="clear" w:color="auto" w:fill="FFFFFF"/>
           </w:tcPr>
           <w:p>
             <w:pPr>
               <w:spacing w:before="40" w:after="40"/>
-              <w:rPr>
-                <w:rFonts w:hint="eastAsia"/>
-              </w:rPr>
             </w:pPr>
             <w:r>
               <w:rPr>
@@ -1933,14 +1794,10 @@
         <w:tc>
           <w:tcPr>
             <w:tcW w:w="7937" w:type="dxa"/>
-            <w:shd w:val="clear" w:color="auto" w:fill="FFFFFF"/>
           </w:tcPr>
           <w:p>
             <w:pPr>
               <w:spacing w:before="40" w:after="40"/>
-              <w:rPr>
-                <w:rFonts w:hint="eastAsia"/>
-              </w:rPr>
             </w:pPr>
             <w:r>
               <w:rPr>
@@ -1958,14 +1815,10 @@
         <w:tc>
           <w:tcPr>
             <w:tcW w:w="1134" w:type="dxa"/>
-            <w:shd w:val="clear" w:color="auto" w:fill="FFFFFF"/>
           </w:tcPr>
           <w:p>
             <w:pPr>
               <w:spacing w:before="40" w:after="40"/>
-              <w:rPr>
-                <w:rFonts w:hint="eastAsia"/>
-              </w:rPr>
             </w:pPr>
             <w:r>
               <w:rPr>
@@ -1978,14 +1831,10 @@
         <w:tc>
           <w:tcPr>
             <w:tcW w:w="7937" w:type="dxa"/>
-            <w:shd w:val="clear" w:color="auto" w:fill="FFFFFF"/>
           </w:tcPr>
           <w:p>
             <w:pPr>
               <w:spacing w:before="40" w:after="40"/>
-              <w:rPr>
-                <w:rFonts w:hint="eastAsia"/>
-              </w:rPr>
             </w:pPr>
             <w:r>
               <w:rPr>
@@ -2003,14 +1852,10 @@
         <w:tc>
           <w:tcPr>
             <w:tcW w:w="1134" w:type="dxa"/>
-            <w:shd w:val="clear" w:color="auto" w:fill="FFFFFF"/>
           </w:tcPr>
           <w:p>
             <w:pPr>
               <w:spacing w:before="40" w:after="40"/>
-              <w:rPr>
-                <w:rFonts w:hint="eastAsia"/>
-              </w:rPr>
             </w:pPr>
             <w:r>
               <w:rPr>
@@ -2023,14 +1868,10 @@
         <w:tc>
           <w:tcPr>
             <w:tcW w:w="7937" w:type="dxa"/>
-            <w:shd w:val="clear" w:color="auto" w:fill="FFFFFF"/>
           </w:tcPr>
           <w:p>
             <w:pPr>
               <w:spacing w:before="40" w:after="40"/>
-              <w:rPr>
-                <w:rFonts w:hint="eastAsia"/>
-              </w:rPr>
             </w:pPr>
             <w:r>
               <w:rPr>
@@ -2048,14 +1889,10 @@
         <w:tc>
           <w:tcPr>
             <w:tcW w:w="1134" w:type="dxa"/>
-            <w:shd w:val="clear" w:color="auto" w:fill="FFFFFF"/>
           </w:tcPr>
           <w:p>
             <w:pPr>
               <w:spacing w:before="40" w:after="40"/>
-              <w:rPr>
-                <w:rFonts w:hint="eastAsia"/>
-              </w:rPr>
             </w:pPr>
             <w:r>
               <w:rPr>
@@ -2068,14 +1905,10 @@
         <w:tc>
           <w:tcPr>
             <w:tcW w:w="7937" w:type="dxa"/>
-            <w:shd w:val="clear" w:color="auto" w:fill="FFFFFF"/>
           </w:tcPr>
           <w:p>
             <w:pPr>
               <w:spacing w:before="40" w:after="40"/>
-              <w:rPr>
-                <w:rFonts w:hint="eastAsia"/>
-              </w:rPr>
             </w:pPr>
             <w:r>
               <w:rPr>
@@ -2093,14 +1926,10 @@
         <w:tc>
           <w:tcPr>
             <w:tcW w:w="1134" w:type="dxa"/>
-            <w:shd w:val="clear" w:color="auto" w:fill="FFFFFF"/>
           </w:tcPr>
           <w:p>
             <w:pPr>
               <w:spacing w:before="40" w:after="40"/>
-              <w:rPr>
-                <w:rFonts w:hint="eastAsia"/>
-              </w:rPr>
             </w:pPr>
             <w:r>
               <w:rPr>
@@ -2113,14 +1942,10 @@
         <w:tc>
           <w:tcPr>
             <w:tcW w:w="7937" w:type="dxa"/>
-            <w:shd w:val="clear" w:color="auto" w:fill="FFFFFF"/>
           </w:tcPr>
           <w:p>
             <w:pPr>
               <w:spacing w:before="40" w:after="40"/>
-              <w:rPr>
-                <w:rFonts w:hint="eastAsia"/>
-              </w:rPr>
             </w:pPr>
             <w:r>
               <w:rPr>
@@ -2138,14 +1963,10 @@
         <w:tc>
           <w:tcPr>
             <w:tcW w:w="1134" w:type="dxa"/>
-            <w:shd w:val="clear" w:color="auto" w:fill="FFFFFF"/>
           </w:tcPr>
           <w:p>
             <w:pPr>
               <w:spacing w:before="40" w:after="40"/>
-              <w:rPr>
-                <w:rFonts w:hint="eastAsia"/>
-              </w:rPr>
             </w:pPr>
             <w:r>
               <w:rPr>
@@ -2158,14 +1979,10 @@
         <w:tc>
           <w:tcPr>
             <w:tcW w:w="7937" w:type="dxa"/>
-            <w:shd w:val="clear" w:color="auto" w:fill="FFFFFF"/>
           </w:tcPr>
           <w:p>
             <w:pPr>
               <w:spacing w:before="40" w:after="40"/>
-              <w:rPr>
-                <w:rFonts w:hint="eastAsia"/>
-              </w:rPr>
             </w:pPr>
             <w:r>
               <w:rPr>
@@ -2183,14 +2000,10 @@
         <w:tc>
           <w:tcPr>
             <w:tcW w:w="1134" w:type="dxa"/>
-            <w:shd w:val="clear" w:color="auto" w:fill="FFFFFF"/>
           </w:tcPr>
           <w:p>
             <w:pPr>
               <w:spacing w:before="40" w:after="40"/>
-              <w:rPr>
-                <w:rFonts w:hint="eastAsia"/>
-              </w:rPr>
             </w:pPr>
             <w:r>
               <w:rPr>
@@ -2203,14 +2016,10 @@
         <w:tc>
           <w:tcPr>
             <w:tcW w:w="7937" w:type="dxa"/>
-            <w:shd w:val="clear" w:color="auto" w:fill="FFFFFF"/>
           </w:tcPr>
           <w:p>
             <w:pPr>
               <w:spacing w:before="40" w:after="40"/>
-              <w:rPr>
-                <w:rFonts w:hint="eastAsia"/>
-              </w:rPr>
             </w:pPr>
             <w:r>
               <w:rPr>
@@ -2228,14 +2037,10 @@
         <w:tc>
           <w:tcPr>
             <w:tcW w:w="1134" w:type="dxa"/>
-            <w:shd w:val="clear" w:color="auto" w:fill="FFFFFF"/>
           </w:tcPr>
           <w:p>
             <w:pPr>
               <w:spacing w:before="40" w:after="40"/>
-              <w:rPr>
-                <w:rFonts w:hint="eastAsia"/>
-              </w:rPr>
             </w:pPr>
             <w:r>
               <w:rPr>
@@ -2248,14 +2053,10 @@
         <w:tc>
           <w:tcPr>
             <w:tcW w:w="7937" w:type="dxa"/>
-            <w:shd w:val="clear" w:color="auto" w:fill="FFFFFF"/>
           </w:tcPr>
           <w:p>
             <w:pPr>
               <w:spacing w:before="40" w:after="40"/>
-              <w:rPr>
-                <w:rFonts w:hint="eastAsia"/>
-              </w:rPr>
             </w:pPr>
             <w:r>
               <w:rPr>
@@ -2270,9 +2071,6 @@
     <w:p>
       <w:pPr>
         <w:spacing w:after="100"/>
-        <w:rPr>
-          <w:rFonts w:hint="eastAsia"/>
-        </w:rPr>
       </w:pPr>
     </w:p>
     <w:p>
@@ -2317,14 +2115,10 @@
         <w:tc>
           <w:tcPr>
             <w:tcW w:w="1361" w:type="dxa"/>
-            <w:shd w:val="clear" w:color="auto" w:fill="FFFFFF"/>
           </w:tcPr>
           <w:p>
             <w:pPr>
               <w:spacing w:before="40" w:after="40"/>
-              <w:rPr>
-                <w:rFonts w:hint="eastAsia"/>
-              </w:rPr>
             </w:pPr>
             <w:r>
               <w:rPr>
@@ -2338,14 +2132,10 @@
         <w:tc>
           <w:tcPr>
             <w:tcW w:w="7710" w:type="dxa"/>
-            <w:shd w:val="clear" w:color="auto" w:fill="FFFFFF"/>
           </w:tcPr>
           <w:p>
             <w:pPr>
               <w:spacing w:before="40" w:after="40"/>
-              <w:rPr>
-                <w:rFonts w:hint="eastAsia"/>
-              </w:rPr>
             </w:pPr>
             <w:r>
               <w:rPr>
@@ -2364,14 +2154,10 @@
         <w:tc>
           <w:tcPr>
             <w:tcW w:w="1361" w:type="dxa"/>
-            <w:shd w:val="clear" w:color="auto" w:fill="FFFFFF"/>
           </w:tcPr>
           <w:p>
             <w:pPr>
               <w:spacing w:before="40" w:after="40"/>
-              <w:rPr>
-                <w:rFonts w:hint="eastAsia"/>
-              </w:rPr>
             </w:pPr>
             <w:r>
               <w:rPr>
@@ -2384,14 +2170,10 @@
         <w:tc>
           <w:tcPr>
             <w:tcW w:w="7710" w:type="dxa"/>
-            <w:shd w:val="clear" w:color="auto" w:fill="FFFFFF"/>
           </w:tcPr>
           <w:p>
             <w:pPr>
               <w:spacing w:before="40" w:after="40"/>
-              <w:rPr>
-                <w:rFonts w:hint="eastAsia"/>
-              </w:rPr>
             </w:pPr>
             <w:r>
               <w:rPr>
@@ -2409,14 +2191,10 @@
         <w:tc>
           <w:tcPr>
             <w:tcW w:w="1361" w:type="dxa"/>
-            <w:shd w:val="clear" w:color="auto" w:fill="FFFFFF"/>
           </w:tcPr>
           <w:p>
             <w:pPr>
               <w:spacing w:before="40" w:after="40"/>
-              <w:rPr>
-                <w:rFonts w:hint="eastAsia"/>
-              </w:rPr>
             </w:pPr>
             <w:r>
               <w:rPr>
@@ -2429,14 +2207,10 @@
         <w:tc>
           <w:tcPr>
             <w:tcW w:w="7710" w:type="dxa"/>
-            <w:shd w:val="clear" w:color="auto" w:fill="FFFFFF"/>
           </w:tcPr>
           <w:p>
             <w:pPr>
               <w:spacing w:before="40" w:after="40"/>
-              <w:rPr>
-                <w:rFonts w:hint="eastAsia"/>
-              </w:rPr>
             </w:pPr>
             <w:r>
               <w:rPr>
@@ -2454,14 +2228,10 @@
         <w:tc>
           <w:tcPr>
             <w:tcW w:w="1361" w:type="dxa"/>
-            <w:shd w:val="clear" w:color="auto" w:fill="FFFFFF"/>
           </w:tcPr>
           <w:p>
             <w:pPr>
               <w:spacing w:before="40" w:after="40"/>
-              <w:rPr>
-                <w:rFonts w:hint="eastAsia"/>
-              </w:rPr>
             </w:pPr>
             <w:r>
               <w:rPr>
@@ -2474,14 +2244,10 @@
         <w:tc>
           <w:tcPr>
             <w:tcW w:w="7710" w:type="dxa"/>
-            <w:shd w:val="clear" w:color="auto" w:fill="FFFFFF"/>
           </w:tcPr>
           <w:p>
             <w:pPr>
               <w:spacing w:before="40" w:after="40"/>
-              <w:rPr>
-                <w:rFonts w:hint="eastAsia"/>
-              </w:rPr>
             </w:pPr>
             <w:r>
               <w:rPr>
@@ -2499,14 +2265,10 @@
         <w:tc>
           <w:tcPr>
             <w:tcW w:w="1361" w:type="dxa"/>
-            <w:shd w:val="clear" w:color="auto" w:fill="FFFFFF"/>
           </w:tcPr>
           <w:p>
             <w:pPr>
               <w:spacing w:before="40" w:after="40"/>
-              <w:rPr>
-                <w:rFonts w:hint="eastAsia"/>
-              </w:rPr>
             </w:pPr>
             <w:r>
               <w:rPr>
@@ -2519,14 +2281,10 @@
         <w:tc>
           <w:tcPr>
             <w:tcW w:w="7710" w:type="dxa"/>
-            <w:shd w:val="clear" w:color="auto" w:fill="FFFFFF"/>
           </w:tcPr>
           <w:p>
             <w:pPr>
               <w:spacing w:before="40" w:after="40"/>
-              <w:rPr>
-                <w:rFonts w:hint="eastAsia"/>
-              </w:rPr>
             </w:pPr>
             <w:r>
               <w:rPr>
@@ -2544,14 +2302,10 @@
         <w:tc>
           <w:tcPr>
             <w:tcW w:w="1361" w:type="dxa"/>
-            <w:shd w:val="clear" w:color="auto" w:fill="FFFFFF"/>
           </w:tcPr>
           <w:p>
             <w:pPr>
               <w:spacing w:before="40" w:after="40"/>
-              <w:rPr>
-                <w:rFonts w:hint="eastAsia"/>
-              </w:rPr>
             </w:pPr>
             <w:r>
               <w:rPr>
@@ -2564,14 +2318,10 @@
         <w:tc>
           <w:tcPr>
             <w:tcW w:w="7710" w:type="dxa"/>
-            <w:shd w:val="clear" w:color="auto" w:fill="FFFFFF"/>
           </w:tcPr>
           <w:p>
             <w:pPr>
               <w:spacing w:before="40" w:after="40"/>
-              <w:rPr>
-                <w:rFonts w:hint="eastAsia"/>
-              </w:rPr>
             </w:pPr>
             <w:r>
               <w:rPr>
@@ -2589,14 +2339,10 @@
         <w:tc>
           <w:tcPr>
             <w:tcW w:w="1361" w:type="dxa"/>
-            <w:shd w:val="clear" w:color="auto" w:fill="FFFFFF"/>
           </w:tcPr>
           <w:p>
             <w:pPr>
               <w:spacing w:before="40" w:after="40"/>
-              <w:rPr>
-                <w:rFonts w:hint="eastAsia"/>
-              </w:rPr>
             </w:pPr>
             <w:r>
               <w:rPr>
@@ -2609,14 +2355,10 @@
         <w:tc>
           <w:tcPr>
             <w:tcW w:w="7710" w:type="dxa"/>
-            <w:shd w:val="clear" w:color="auto" w:fill="FFFFFF"/>
           </w:tcPr>
           <w:p>
             <w:pPr>
               <w:spacing w:before="40" w:after="40"/>
-              <w:rPr>
-                <w:rFonts w:hint="eastAsia"/>
-              </w:rPr>
             </w:pPr>
             <w:r>
               <w:rPr>
@@ -2634,14 +2376,10 @@
         <w:tc>
           <w:tcPr>
             <w:tcW w:w="1361" w:type="dxa"/>
-            <w:shd w:val="clear" w:color="auto" w:fill="FFFFFF"/>
           </w:tcPr>
           <w:p>
             <w:pPr>
               <w:spacing w:before="40" w:after="40"/>
-              <w:rPr>
-                <w:rFonts w:hint="eastAsia"/>
-              </w:rPr>
             </w:pPr>
             <w:r>
               <w:rPr>
@@ -2654,14 +2392,10 @@
         <w:tc>
           <w:tcPr>
             <w:tcW w:w="7710" w:type="dxa"/>
-            <w:shd w:val="clear" w:color="auto" w:fill="FFFFFF"/>
           </w:tcPr>
           <w:p>
             <w:pPr>
               <w:spacing w:before="40" w:after="40"/>
-              <w:rPr>
-                <w:rFonts w:hint="eastAsia"/>
-              </w:rPr>
             </w:pPr>
             <w:r>
               <w:rPr>
@@ -2679,14 +2413,10 @@
         <w:tc>
           <w:tcPr>
             <w:tcW w:w="1361" w:type="dxa"/>
-            <w:shd w:val="clear" w:color="auto" w:fill="FFFFFF"/>
           </w:tcPr>
           <w:p>
             <w:pPr>
               <w:spacing w:before="40" w:after="40"/>
-              <w:rPr>
-                <w:rFonts w:hint="eastAsia"/>
-              </w:rPr>
             </w:pPr>
             <w:r>
               <w:rPr>
@@ -2699,14 +2429,10 @@
         <w:tc>
           <w:tcPr>
             <w:tcW w:w="7710" w:type="dxa"/>
-            <w:shd w:val="clear" w:color="auto" w:fill="FFFFFF"/>
           </w:tcPr>
           <w:p>
             <w:pPr>
               <w:spacing w:before="40" w:after="40"/>
-              <w:rPr>
-                <w:rFonts w:hint="eastAsia"/>
-              </w:rPr>
             </w:pPr>
             <w:r>
               <w:rPr>
@@ -2724,14 +2450,10 @@
         <w:tc>
           <w:tcPr>
             <w:tcW w:w="1361" w:type="dxa"/>
-            <w:shd w:val="clear" w:color="auto" w:fill="FFFFFF"/>
           </w:tcPr>
           <w:p>
             <w:pPr>
               <w:spacing w:before="40" w:after="40"/>
-              <w:rPr>
-                <w:rFonts w:hint="eastAsia"/>
-              </w:rPr>
             </w:pPr>
             <w:r>
               <w:rPr>
@@ -2744,14 +2466,10 @@
         <w:tc>
           <w:tcPr>
             <w:tcW w:w="7710" w:type="dxa"/>
-            <w:shd w:val="clear" w:color="auto" w:fill="FFFFFF"/>
           </w:tcPr>
           <w:p>
             <w:pPr>
               <w:spacing w:before="40" w:after="40"/>
-              <w:rPr>
-                <w:rFonts w:hint="eastAsia"/>
-              </w:rPr>
             </w:pPr>
             <w:r>
               <w:rPr>
@@ -2769,14 +2487,10 @@
         <w:tc>
           <w:tcPr>
             <w:tcW w:w="1361" w:type="dxa"/>
-            <w:shd w:val="clear" w:color="auto" w:fill="FFFFFF"/>
           </w:tcPr>
           <w:p>
             <w:pPr>
               <w:spacing w:before="40" w:after="40"/>
-              <w:rPr>
-                <w:rFonts w:hint="eastAsia"/>
-              </w:rPr>
             </w:pPr>
             <w:r>
               <w:rPr>
@@ -2789,14 +2503,10 @@
         <w:tc>
           <w:tcPr>
             <w:tcW w:w="7710" w:type="dxa"/>
-            <w:shd w:val="clear" w:color="auto" w:fill="FFFFFF"/>
           </w:tcPr>
           <w:p>
             <w:pPr>
               <w:spacing w:before="40" w:after="40"/>
-              <w:rPr>
-                <w:rFonts w:hint="eastAsia"/>
-              </w:rPr>
             </w:pPr>
             <w:r>
               <w:rPr>
@@ -2811,9 +2521,6 @@
     <w:p>
       <w:pPr>
         <w:spacing w:after="100"/>
-        <w:rPr>
-          <w:rFonts w:hint="eastAsia"/>
-        </w:rPr>
       </w:pPr>
     </w:p>
     <w:p>
@@ -2844,14 +2551,10 @@
         <w:tc>
           <w:tcPr>
             <w:tcW w:w="1361" w:type="dxa"/>
-            <w:shd w:val="clear" w:color="auto" w:fill="FFFFFF"/>
           </w:tcPr>
           <w:p>
             <w:pPr>
               <w:spacing w:before="40" w:after="40"/>
-              <w:rPr>
-                <w:rFonts w:hint="eastAsia"/>
-              </w:rPr>
             </w:pPr>
             <w:r>
               <w:rPr>
@@ -2865,14 +2568,10 @@
         <w:tc>
           <w:tcPr>
             <w:tcW w:w="7710" w:type="dxa"/>
-            <w:shd w:val="clear" w:color="auto" w:fill="FFFFFF"/>
           </w:tcPr>
           <w:p>
             <w:pPr>
               <w:spacing w:before="40" w:after="40"/>
-              <w:rPr>
-                <w:rFonts w:hint="eastAsia"/>
-              </w:rPr>
             </w:pPr>
             <w:r>
               <w:rPr>
@@ -2891,14 +2590,10 @@
         <w:tc>
           <w:tcPr>
             <w:tcW w:w="1361" w:type="dxa"/>
-            <w:shd w:val="clear" w:color="auto" w:fill="FFFFFF"/>
           </w:tcPr>
           <w:p>
             <w:pPr>
               <w:spacing w:before="40" w:after="40"/>
-              <w:rPr>
-                <w:rFonts w:hint="eastAsia"/>
-              </w:rPr>
             </w:pPr>
             <w:r>
               <w:rPr>
@@ -2911,14 +2606,10 @@
         <w:tc>
           <w:tcPr>
             <w:tcW w:w="7710" w:type="dxa"/>
-            <w:shd w:val="clear" w:color="auto" w:fill="FFFFFF"/>
           </w:tcPr>
           <w:p>
             <w:pPr>
               <w:spacing w:before="40" w:after="40"/>
-              <w:rPr>
-                <w:rFonts w:hint="eastAsia"/>
-              </w:rPr>
             </w:pPr>
             <w:r>
               <w:rPr>
@@ -2936,14 +2627,10 @@
         <w:tc>
           <w:tcPr>
             <w:tcW w:w="1361" w:type="dxa"/>
-            <w:shd w:val="clear" w:color="auto" w:fill="FFFFFF"/>
           </w:tcPr>
           <w:p>
             <w:pPr>
               <w:spacing w:before="40" w:after="40"/>
-              <w:rPr>
-                <w:rFonts w:hint="eastAsia"/>
-              </w:rPr>
             </w:pPr>
             <w:r>
               <w:rPr>
@@ -2956,14 +2643,10 @@
         <w:tc>
           <w:tcPr>
             <w:tcW w:w="7710" w:type="dxa"/>
-            <w:shd w:val="clear" w:color="auto" w:fill="FFFFFF"/>
           </w:tcPr>
           <w:p>
             <w:pPr>
               <w:spacing w:before="40" w:after="40"/>
-              <w:rPr>
-                <w:rFonts w:hint="eastAsia"/>
-              </w:rPr>
             </w:pPr>
             <w:r>
               <w:rPr>
@@ -2981,14 +2664,10 @@
         <w:tc>
           <w:tcPr>
             <w:tcW w:w="1361" w:type="dxa"/>
-            <w:shd w:val="clear" w:color="auto" w:fill="FFFFFF"/>
           </w:tcPr>
           <w:p>
             <w:pPr>
               <w:spacing w:before="40" w:after="40"/>
-              <w:rPr>
-                <w:rFonts w:hint="eastAsia"/>
-              </w:rPr>
             </w:pPr>
             <w:r>
               <w:rPr>
@@ -3001,14 +2680,10 @@
         <w:tc>
           <w:tcPr>
             <w:tcW w:w="7710" w:type="dxa"/>
-            <w:shd w:val="clear" w:color="auto" w:fill="FFFFFF"/>
           </w:tcPr>
           <w:p>
             <w:pPr>
               <w:spacing w:before="40" w:after="40"/>
-              <w:rPr>
-                <w:rFonts w:hint="eastAsia"/>
-              </w:rPr>
             </w:pPr>
             <w:r>
               <w:rPr>
@@ -3026,14 +2701,10 @@
         <w:tc>
           <w:tcPr>
             <w:tcW w:w="1361" w:type="dxa"/>
-            <w:shd w:val="clear" w:color="auto" w:fill="FFFFFF"/>
           </w:tcPr>
           <w:p>
             <w:pPr>
               <w:spacing w:before="40" w:after="40"/>
-              <w:rPr>
-                <w:rFonts w:hint="eastAsia"/>
-              </w:rPr>
             </w:pPr>
             <w:r>
               <w:rPr>
@@ -3046,14 +2717,10 @@
         <w:tc>
           <w:tcPr>
             <w:tcW w:w="7710" w:type="dxa"/>
-            <w:shd w:val="clear" w:color="auto" w:fill="FFFFFF"/>
           </w:tcPr>
           <w:p>
             <w:pPr>
               <w:spacing w:before="40" w:after="40"/>
-              <w:rPr>
-                <w:rFonts w:hint="eastAsia"/>
-              </w:rPr>
             </w:pPr>
             <w:r>
               <w:rPr>
@@ -3071,14 +2738,10 @@
         <w:tc>
           <w:tcPr>
             <w:tcW w:w="1361" w:type="dxa"/>
-            <w:shd w:val="clear" w:color="auto" w:fill="FFFFFF"/>
           </w:tcPr>
           <w:p>
             <w:pPr>
               <w:spacing w:before="40" w:after="40"/>
-              <w:rPr>
-                <w:rFonts w:hint="eastAsia"/>
-              </w:rPr>
             </w:pPr>
             <w:r>
               <w:rPr>
@@ -3091,14 +2754,10 @@
         <w:tc>
           <w:tcPr>
             <w:tcW w:w="7710" w:type="dxa"/>
-            <w:shd w:val="clear" w:color="auto" w:fill="FFFFFF"/>
           </w:tcPr>
           <w:p>
             <w:pPr>
               <w:spacing w:before="40" w:after="40"/>
-              <w:rPr>
-                <w:rFonts w:hint="eastAsia"/>
-              </w:rPr>
             </w:pPr>
             <w:r>
               <w:rPr>
@@ -3113,9 +2772,6 @@
     <w:p>
       <w:pPr>
         <w:spacing w:after="100"/>
-        <w:rPr>
-          <w:rFonts w:hint="eastAsia"/>
-        </w:rPr>
       </w:pPr>
     </w:p>
     <w:p>
@@ -3130,17 +2786,546 @@
     <w:p>
       <w:pPr>
         <w:spacing w:after="100"/>
-        <w:rPr>
-          <w:rFonts w:hint="eastAsia"/>
-        </w:rPr>
       </w:pPr>
       <w:r>
         <w:t>Administratori kyçet → zgjedh një banesë të lirë → regjistron qiramarrësin → krijon kontratën → sistemi e shënon banesën si të zënë → regjistrohet pagesa mujore → paneli përditëson gjendjen.</w:t>
       </w:r>
     </w:p>
+    <w:p>
+      <w:r>
+        <w:br w:type="page"/>
+      </w:r>
+    </w:p>
+    <w:p>
+      <w:pPr>
+        <w:spacing w:before="300" w:after="120"/>
+      </w:pPr>
+      <w:r>
+        <w:rPr>
+          <w:b/>
+          <w:sz w:val="32"/>
+        </w:rPr>
+        <w:lastRenderedPageBreak/>
+        <w:t>04  |  Teknologjitë e planifikuara</w:t>
+      </w:r>
+    </w:p>
+    <w:p>
+      <w:pPr>
+        <w:spacing w:after="120" w:line="269" w:lineRule="auto"/>
+      </w:pPr>
+      <w:r>
+        <w:t>Për realizimin e aplikacionit është planifikuar një kombinim teknologjish që lehtëson menaxhimin e banesave, kontratave dhe pagesave. Këto janë zgjedhje fillestare, që mund të përshtaten gjatë implementimit.</w:t>
+      </w:r>
+    </w:p>
+    <w:tbl>
+      <w:tblPr>
+        <w:tblStyle w:val="TableGrid"/>
+        <w:tblW w:w="0" w:type="auto"/>
+        <w:jc w:val="center"/>
+        <w:tblLook w:val="04A0" w:firstRow="1" w:lastRow="0" w:firstColumn="1" w:lastColumn="0" w:noHBand="0" w:noVBand="1"/>
+      </w:tblPr>
+      <w:tblGrid>
+        <w:gridCol w:w="4844"/>
+        <w:gridCol w:w="4844"/>
+      </w:tblGrid>
+      <w:tr>
+        <w:trPr>
+          <w:tblHeader/>
+          <w:jc w:val="center"/>
+        </w:trPr>
+        <w:tc>
+          <w:tcPr>
+            <w:tcW w:w="4844" w:type="dxa"/>
+          </w:tcPr>
+          <w:p>
+            <w:pPr>
+              <w:spacing w:after="20"/>
+            </w:pPr>
+            <w:r>
+              <w:rPr>
+                <w:b/>
+                <w:sz w:val="18"/>
+              </w:rPr>
+              <w:t>Teknologjia</w:t>
+            </w:r>
+          </w:p>
+        </w:tc>
+        <w:tc>
+          <w:tcPr>
+            <w:tcW w:w="4844" w:type="dxa"/>
+          </w:tcPr>
+          <w:p>
+            <w:pPr>
+              <w:spacing w:after="20"/>
+            </w:pPr>
+            <w:r>
+              <w:rPr>
+                <w:b/>
+                <w:sz w:val="18"/>
+              </w:rPr>
+              <w:t>Përdorimi në projekt</w:t>
+            </w:r>
+          </w:p>
+        </w:tc>
+      </w:tr>
+      <w:tr>
+        <w:trPr>
+          <w:jc w:val="center"/>
+        </w:trPr>
+        <w:tc>
+          <w:tcPr>
+            <w:tcW w:w="4844" w:type="dxa"/>
+          </w:tcPr>
+          <w:p>
+            <w:pPr>
+              <w:spacing w:after="20"/>
+            </w:pPr>
+            <w:r>
+              <w:rPr>
+                <w:sz w:val="18"/>
+              </w:rPr>
+              <w:t>Python + Django</w:t>
+            </w:r>
+          </w:p>
+        </w:tc>
+        <w:tc>
+          <w:tcPr>
+            <w:tcW w:w="4844" w:type="dxa"/>
+          </w:tcPr>
+          <w:p>
+            <w:pPr>
+              <w:spacing w:after="20"/>
+            </w:pPr>
+            <w:r>
+              <w:rPr>
+                <w:sz w:val="18"/>
+              </w:rPr>
+              <w:t>Logjika e aplikacionit, autentikimi, modelet dhe menaxhimi i të dhënave.</w:t>
+            </w:r>
+          </w:p>
+        </w:tc>
+      </w:tr>
+      <w:tr>
+        <w:trPr>
+          <w:jc w:val="center"/>
+        </w:trPr>
+        <w:tc>
+          <w:tcPr>
+            <w:tcW w:w="4844" w:type="dxa"/>
+          </w:tcPr>
+          <w:p>
+            <w:pPr>
+              <w:spacing w:after="20"/>
+            </w:pPr>
+            <w:r>
+              <w:rPr>
+                <w:sz w:val="18"/>
+              </w:rPr>
+              <w:t>HTML, CSS, JavaScript</w:t>
+            </w:r>
+          </w:p>
+        </w:tc>
+        <w:tc>
+          <w:tcPr>
+            <w:tcW w:w="4844" w:type="dxa"/>
+          </w:tcPr>
+          <w:p>
+            <w:pPr>
+              <w:spacing w:after="20"/>
+            </w:pPr>
+            <w:r>
+              <w:rPr>
+                <w:sz w:val="18"/>
+              </w:rPr>
+              <w:t>Ndërtimi dhe ndërveprimi me faqet e aplikacionit.</w:t>
+            </w:r>
+          </w:p>
+        </w:tc>
+      </w:tr>
+      <w:tr>
+        <w:trPr>
+          <w:jc w:val="center"/>
+        </w:trPr>
+        <w:tc>
+          <w:tcPr>
+            <w:tcW w:w="4844" w:type="dxa"/>
+          </w:tcPr>
+          <w:p>
+            <w:pPr>
+              <w:spacing w:after="20"/>
+            </w:pPr>
+            <w:r>
+              <w:rPr>
+                <w:sz w:val="18"/>
+              </w:rPr>
+              <w:t>Bootstrap</w:t>
+            </w:r>
+          </w:p>
+        </w:tc>
+        <w:tc>
+          <w:tcPr>
+            <w:tcW w:w="4844" w:type="dxa"/>
+          </w:tcPr>
+          <w:p>
+            <w:pPr>
+              <w:spacing w:after="20"/>
+            </w:pPr>
+            <w:r>
+              <w:rPr>
+                <w:sz w:val="18"/>
+              </w:rPr>
+              <w:t>Përshtatja e pamjes për kompjuter dhe telefon.</w:t>
+            </w:r>
+          </w:p>
+        </w:tc>
+      </w:tr>
+      <w:tr>
+        <w:trPr>
+          <w:jc w:val="center"/>
+        </w:trPr>
+        <w:tc>
+          <w:tcPr>
+            <w:tcW w:w="4844" w:type="dxa"/>
+          </w:tcPr>
+          <w:p>
+            <w:pPr>
+              <w:spacing w:after="20"/>
+            </w:pPr>
+            <w:r>
+              <w:rPr>
+                <w:sz w:val="18"/>
+              </w:rPr>
+              <w:t>MySQL</w:t>
+            </w:r>
+          </w:p>
+        </w:tc>
+        <w:tc>
+          <w:tcPr>
+            <w:tcW w:w="4844" w:type="dxa"/>
+          </w:tcPr>
+          <w:p>
+            <w:pPr>
+              <w:spacing w:after="20"/>
+            </w:pPr>
+            <w:r>
+              <w:rPr>
+                <w:sz w:val="18"/>
+              </w:rPr>
+              <w:t>Ruajtja e të dhënave për banesat, pronarët, qiramarrësit, kontratat dhe pagesat.</w:t>
+            </w:r>
+          </w:p>
+        </w:tc>
+      </w:tr>
+      <w:tr>
+        <w:trPr>
+          <w:jc w:val="center"/>
+        </w:trPr>
+        <w:tc>
+          <w:tcPr>
+            <w:tcW w:w="4844" w:type="dxa"/>
+          </w:tcPr>
+          <w:p>
+            <w:pPr>
+              <w:spacing w:after="20"/>
+            </w:pPr>
+            <w:r>
+              <w:rPr>
+                <w:sz w:val="18"/>
+              </w:rPr>
+              <w:t>Git dhe GitHub</w:t>
+            </w:r>
+          </w:p>
+        </w:tc>
+        <w:tc>
+          <w:tcPr>
+            <w:tcW w:w="4844" w:type="dxa"/>
+          </w:tcPr>
+          <w:p>
+            <w:pPr>
+              <w:spacing w:after="20"/>
+            </w:pPr>
+            <w:r>
+              <w:rPr>
+                <w:sz w:val="18"/>
+              </w:rPr>
+              <w:t>Ruajtja e versioneve të kodit dhe ndjekja e progresit të projektit.</w:t>
+            </w:r>
+          </w:p>
+        </w:tc>
+      </w:tr>
+    </w:tbl>
+    <w:p>
+      <w:pPr>
+        <w:spacing w:after="20"/>
+      </w:pPr>
+    </w:p>
+    <w:p>
+      <w:pPr>
+        <w:spacing w:after="120" w:line="269" w:lineRule="auto"/>
+      </w:pPr>
+      <w:r>
+        <w:t>Django është propozuar sepse ka mjete të gatshme për kyçje dhe për punë me databazën. Kjo na ndihmon të përqendrohemi te funksionet kryesore të projektit.</w:t>
+      </w:r>
+    </w:p>
+    <w:p>
+      <w:pPr>
+        <w:spacing w:before="300" w:after="120"/>
+      </w:pPr>
+      <w:r>
+        <w:rPr>
+          <w:b/>
+          <w:sz w:val="32"/>
+        </w:rPr>
+        <w:t>05  |  Arkitektura e sistemit</w:t>
+      </w:r>
+    </w:p>
+    <w:p>
+      <w:pPr>
+        <w:spacing w:after="120" w:line="269" w:lineRule="auto"/>
+      </w:pPr>
+      <w:r>
+        <w:t>Aplikacioni planifikohet të ketë tri pjesë kryesore. Përdoruesi kryen veprimet në ndërfaqe, Django i përpunon kërkesat dhe databaza ruan ose kthen informacionin.</w:t>
+      </w:r>
+    </w:p>
+    <w:tbl>
+      <w:tblPr>
+        <w:tblStyle w:val="TableGrid"/>
+        <w:tblW w:w="0" w:type="auto"/>
+        <w:jc w:val="center"/>
+        <w:tblLook w:val="04A0" w:firstRow="1" w:lastRow="0" w:firstColumn="1" w:lastColumn="0" w:noHBand="0" w:noVBand="1"/>
+      </w:tblPr>
+      <w:tblGrid>
+        <w:gridCol w:w="4844"/>
+        <w:gridCol w:w="4844"/>
+      </w:tblGrid>
+      <w:tr>
+        <w:trPr>
+          <w:tblHeader/>
+          <w:jc w:val="center"/>
+        </w:trPr>
+        <w:tc>
+          <w:tcPr>
+            <w:tcW w:w="4844" w:type="dxa"/>
+          </w:tcPr>
+          <w:p>
+            <w:pPr>
+              <w:spacing w:after="20"/>
+            </w:pPr>
+            <w:r>
+              <w:rPr>
+                <w:b/>
+                <w:sz w:val="18"/>
+              </w:rPr>
+              <w:t>Pjesa</w:t>
+            </w:r>
+          </w:p>
+        </w:tc>
+        <w:tc>
+          <w:tcPr>
+            <w:tcW w:w="4844" w:type="dxa"/>
+          </w:tcPr>
+          <w:p>
+            <w:pPr>
+              <w:spacing w:after="20"/>
+            </w:pPr>
+            <w:r>
+              <w:rPr>
+                <w:b/>
+                <w:sz w:val="18"/>
+              </w:rPr>
+              <w:t>Detyra kryesore</w:t>
+            </w:r>
+          </w:p>
+        </w:tc>
+      </w:tr>
+      <w:tr>
+        <w:trPr>
+          <w:jc w:val="center"/>
+        </w:trPr>
+        <w:tc>
+          <w:tcPr>
+            <w:tcW w:w="4844" w:type="dxa"/>
+          </w:tcPr>
+          <w:p>
+            <w:pPr>
+              <w:spacing w:after="20"/>
+            </w:pPr>
+            <w:r>
+              <w:rPr>
+                <w:sz w:val="18"/>
+              </w:rPr>
+              <w:t>Frontend (HTML, CSS, JavaScript, Bootstrap)</w:t>
+            </w:r>
+          </w:p>
+        </w:tc>
+        <w:tc>
+          <w:tcPr>
+            <w:tcW w:w="4844" w:type="dxa"/>
+          </w:tcPr>
+          <w:p>
+            <w:pPr>
+              <w:spacing w:after="20"/>
+            </w:pPr>
+            <w:r>
+              <w:rPr>
+                <w:sz w:val="18"/>
+              </w:rPr>
+              <w:t>Shfaq formularët, listat e banesave dhe të dhënat e kontratave.</w:t>
+            </w:r>
+          </w:p>
+        </w:tc>
+      </w:tr>
+      <w:tr>
+        <w:trPr>
+          <w:jc w:val="center"/>
+        </w:trPr>
+        <w:tc>
+          <w:tcPr>
+            <w:tcW w:w="4844" w:type="dxa"/>
+          </w:tcPr>
+          <w:p>
+            <w:pPr>
+              <w:spacing w:after="20"/>
+            </w:pPr>
+            <w:r>
+              <w:rPr>
+                <w:sz w:val="18"/>
+              </w:rPr>
+              <w:t>Backend (Python / Django)</w:t>
+            </w:r>
+          </w:p>
+        </w:tc>
+        <w:tc>
+          <w:tcPr>
+            <w:tcW w:w="4844" w:type="dxa"/>
+          </w:tcPr>
+          <w:p>
+            <w:pPr>
+              <w:spacing w:after="20"/>
+            </w:pPr>
+            <w:r>
+              <w:rPr>
+                <w:sz w:val="18"/>
+              </w:rPr>
+              <w:t>Kontrollon të dhënat, zbaton rregullat e kontratave dhe përpunon pagesat.</w:t>
+            </w:r>
+          </w:p>
+        </w:tc>
+      </w:tr>
+      <w:tr>
+        <w:trPr>
+          <w:jc w:val="center"/>
+        </w:trPr>
+        <w:tc>
+          <w:tcPr>
+            <w:tcW w:w="4844" w:type="dxa"/>
+          </w:tcPr>
+          <w:p>
+            <w:pPr>
+              <w:spacing w:after="20"/>
+            </w:pPr>
+            <w:r>
+              <w:rPr>
+                <w:sz w:val="18"/>
+              </w:rPr>
+              <w:t>Databaza (MySQL)</w:t>
+            </w:r>
+          </w:p>
+        </w:tc>
+        <w:tc>
+          <w:tcPr>
+            <w:tcW w:w="4844" w:type="dxa"/>
+          </w:tcPr>
+          <w:p>
+            <w:pPr>
+              <w:spacing w:after="20"/>
+            </w:pPr>
+            <w:r>
+              <w:rPr>
+                <w:sz w:val="18"/>
+              </w:rPr>
+              <w:t>Ruan të dhënat dhe relacionet ndërmjet entiteteve.</w:t>
+            </w:r>
+          </w:p>
+        </w:tc>
+      </w:tr>
+    </w:tbl>
+    <w:p>
+      <w:pPr>
+        <w:spacing w:after="20"/>
+      </w:pPr>
+    </w:p>
+    <w:p>
+      <w:pPr>
+        <w:keepNext/>
+        <w:spacing w:after="120" w:line="269" w:lineRule="auto"/>
+      </w:pPr>
+      <w:r>
+        <w:t>Diagrami i arkitekturës:</w:t>
+      </w:r>
+    </w:p>
+    <w:p>
+      <w:pPr>
+        <w:spacing w:before="40" w:after="80" w:line="240" w:lineRule="auto"/>
+        <w:jc w:val="center"/>
+      </w:pPr>
+      <w:r>
+        <w:rPr>
+          <w:noProof/>
+        </w:rPr>
+        <w:drawing>
+          <wp:inline distT="0" distB="0" distL="0" distR="0" wp14:anchorId="01AA335E" wp14:editId="79815651">
+            <wp:extent cx="4160520" cy="2606040"/>
+            <wp:effectExtent l="0" t="0" r="0" b="0"/>
+            <wp:docPr id="1" name="Picture 1"/>
+            <wp:cNvGraphicFramePr>
+              <a:graphicFrameLocks xmlns:a="http://schemas.openxmlformats.org/drawingml/2006/main" noChangeAspect="1"/>
+            </wp:cNvGraphicFramePr>
+            <a:graphic xmlns:a="http://schemas.openxmlformats.org/drawingml/2006/main">
+              <a:graphicData uri="http://schemas.openxmlformats.org/drawingml/2006/picture">
+                <pic:pic xmlns:pic="http://schemas.openxmlformats.org/drawingml/2006/picture">
+                  <pic:nvPicPr>
+                    <pic:cNvPr id="0" name="diagrami_arkitektures_agnesa.png"/>
+                    <pic:cNvPicPr/>
+                  </pic:nvPicPr>
+                  <pic:blipFill>
+                    <a:blip r:embed="rId8"/>
+                    <a:stretch>
+                      <a:fillRect/>
+                    </a:stretch>
+                  </pic:blipFill>
+                  <pic:spPr>
+                    <a:xfrm>
+                      <a:off x="0" y="0"/>
+                      <a:ext cx="4160520" cy="2606040"/>
+                    </a:xfrm>
+                    <a:prstGeom prst="rect">
+                      <a:avLst/>
+                    </a:prstGeom>
+                  </pic:spPr>
+                </pic:pic>
+              </a:graphicData>
+            </a:graphic>
+          </wp:inline>
+        </w:drawing>
+      </w:r>
+    </w:p>
+    <w:p>
+      <w:pPr>
+        <w:spacing w:after="20"/>
+      </w:pPr>
+    </w:p>
+    <w:p>
+      <w:pPr>
+        <w:spacing w:after="120" w:line="269" w:lineRule="auto"/>
+      </w:pPr>
+      <w:r>
+        <w:t>Shembull: administratori plotëson formularin e kontratës. Django kontrollon nëse banesa është e lirë dhe nëse datat janë të vlefshme. Nëse çdo gjë është në rregull, kontrata ruhet në databazë.</w:t>
+      </w:r>
+    </w:p>
     <w:sectPr>
-      <w:headerReference w:type="default" r:id="rId8"/>
-      <w:footerReference w:type="default" r:id="rId9"/>
+      <w:headerReference w:type="default" r:id="rId9"/>
+      <w:footerReference w:type="default" r:id="rId10"/>
       <w:pgSz w:w="12240" w:h="15840"/>
       <w:pgMar w:top="822" w:right="1276" w:bottom="822" w:left="1276" w:header="482" w:footer="510" w:gutter="0"/>
       <w:cols w:space="720"/>
@@ -3157,9 +3342,6 @@
     <w:p>
       <w:pPr>
         <w:spacing w:after="0" w:line="240" w:lineRule="auto"/>
-        <w:rPr>
-          <w:rFonts w:hint="eastAsia"/>
-        </w:rPr>
       </w:pPr>
       <w:r>
         <w:separator/>
@@ -3170,9 +3352,6 @@
     <w:p>
       <w:pPr>
         <w:spacing w:after="0" w:line="240" w:lineRule="auto"/>
-        <w:rPr>
-          <w:rFonts w:hint="eastAsia"/>
-        </w:rPr>
       </w:pPr>
       <w:r>
         <w:continuationSeparator/>
@@ -3188,9 +3367,6 @@
     <w:pPr>
       <w:pStyle w:val="Footer"/>
       <w:jc w:val="center"/>
-      <w:rPr>
-        <w:rFonts w:hint="eastAsia"/>
-      </w:rPr>
     </w:pPr>
     <w:r>
       <w:rPr>
@@ -3208,9 +3384,6 @@
     <w:p>
       <w:pPr>
         <w:spacing w:after="0" w:line="240" w:lineRule="auto"/>
-        <w:rPr>
-          <w:rFonts w:hint="eastAsia"/>
-        </w:rPr>
       </w:pPr>
       <w:r>
         <w:separator/>
@@ -3221,9 +3394,6 @@
     <w:p>
       <w:pPr>
         <w:spacing w:after="0" w:line="240" w:lineRule="auto"/>
-        <w:rPr>
-          <w:rFonts w:hint="eastAsia"/>
-        </w:rPr>
       </w:pPr>
       <w:r>
         <w:continuationSeparator/>
@@ -3239,9 +3409,6 @@
     <w:pPr>
       <w:pStyle w:val="Header"/>
       <w:jc w:val="right"/>
-      <w:rPr>
-        <w:rFonts w:hint="eastAsia"/>
-      </w:rPr>
     </w:pPr>
     <w:r>
       <w:rPr>
@@ -3443,31 +3610,31 @@
       </w:rPr>
     </w:lvl>
   </w:abstractNum>
-  <w:num w:numId="1" w16cid:durableId="2044401838">
+  <w:num w:numId="1" w16cid:durableId="155146701">
     <w:abstractNumId w:val="8"/>
   </w:num>
-  <w:num w:numId="2" w16cid:durableId="2000421197">
+  <w:num w:numId="2" w16cid:durableId="1967391319">
     <w:abstractNumId w:val="6"/>
   </w:num>
-  <w:num w:numId="3" w16cid:durableId="1004208595">
+  <w:num w:numId="3" w16cid:durableId="703408110">
     <w:abstractNumId w:val="5"/>
   </w:num>
-  <w:num w:numId="4" w16cid:durableId="1816876814">
+  <w:num w:numId="4" w16cid:durableId="997684682">
     <w:abstractNumId w:val="4"/>
   </w:num>
-  <w:num w:numId="5" w16cid:durableId="355156161">
+  <w:num w:numId="5" w16cid:durableId="2021200638">
     <w:abstractNumId w:val="7"/>
   </w:num>
-  <w:num w:numId="6" w16cid:durableId="1977951552">
+  <w:num w:numId="6" w16cid:durableId="599677752">
     <w:abstractNumId w:val="3"/>
   </w:num>
-  <w:num w:numId="7" w16cid:durableId="882717503">
+  <w:num w:numId="7" w16cid:durableId="1247691681">
     <w:abstractNumId w:val="2"/>
   </w:num>
-  <w:num w:numId="8" w16cid:durableId="206072031">
+  <w:num w:numId="8" w16cid:durableId="487868784">
     <w:abstractNumId w:val="1"/>
   </w:num>
-  <w:num w:numId="9" w16cid:durableId="1380124903">
+  <w:num w:numId="9" w16cid:durableId="737244756">
     <w:abstractNumId w:val="0"/>
   </w:num>
 </w:numbering>

</xml_diff>